<commit_message>
update Word Templates and adds new timeentry type
</commit_message>
<xml_diff>
--- a/AppPresenze/presenze/templates/Template_Trasferte.docx
+++ b/AppPresenze/presenze/templates/Template_Trasferte.docx
@@ -90,43 +90,7 @@
           <w:lang w:eastAsia="it-IT"/>
           <w14:ligatures w14:val="none"/>
         </w:rPr>
-        <w:t xml:space="preserve">#NomeCognome </w:t>
-      </w:r>
-      <w:r>
-        <w:rPr>
-          <w:rFonts w:ascii="Cavolini" w:eastAsia="Times New Roman" w:hAnsi="Cavolini" w:cs="Cavolini"/>
-          <w:color w:val="000000"/>
-          <w:kern w:val="0"/>
-          <w:sz w:val="32"/>
-          <w:szCs w:val="32"/>
-          <w:lang w:eastAsia="it-IT"/>
-          <w14:ligatures w14:val="none"/>
-        </w:rPr>
-        <w:t>–</w:t>
-      </w:r>
-      <w:r>
-        <w:rPr>
-          <w:rFonts w:ascii="Cavolini" w:eastAsia="Times New Roman" w:hAnsi="Cavolini" w:cs="Cavolini"/>
-          <w:color w:val="000000"/>
-          <w:kern w:val="0"/>
-          <w:sz w:val="32"/>
-          <w:szCs w:val="32"/>
-          <w:lang w:eastAsia="it-IT"/>
-          <w14:ligatures w14:val="none"/>
-        </w:rPr>
-        <w:t xml:space="preserve"> </w:t>
-      </w:r>
-      <w:r>
-        <w:rPr>
-          <w:rFonts w:ascii="Cavolini" w:eastAsia="Times New Roman" w:hAnsi="Cavolini" w:cs="Cavolini"/>
-          <w:color w:val="000000"/>
-          <w:kern w:val="0"/>
-          <w:sz w:val="32"/>
-          <w:szCs w:val="32"/>
-          <w:lang w:eastAsia="it-IT"/>
-          <w14:ligatures w14:val="none"/>
-        </w:rPr>
-        <w:t>Dipendente</w:t>
+        <w:t>#NomeCognome</w:t>
       </w:r>
     </w:p>
     <w:p/>
@@ -269,19 +233,31 @@
               <w:bottom w:val="nil"/>
               <w:right w:val="nil"/>
             </w:tcBorders>
-            <w:vAlign w:val="center"/>
-            <w:hideMark/>
-          </w:tcPr>
-          <w:p>
-            <w:pPr>
-              <w:spacing w:after="0" w:line="240" w:lineRule="auto"/>
-              <w:rPr>
-                <w:rFonts w:ascii="Times New Roman" w:eastAsia="Times New Roman" w:hAnsi="Times New Roman" w:cs="Times New Roman"/>
-                <w:kern w:val="0"/>
-                <w:lang w:eastAsia="it-IT"/>
-                <w14:ligatures w14:val="none"/>
-              </w:rPr>
-            </w:pPr>
+            <w:shd w:val="clear" w:color="auto" w:fill="D9F2D0" w:themeFill="accent6" w:themeFillTint="33"/>
+            <w:vAlign w:val="center"/>
+          </w:tcPr>
+          <w:p>
+            <w:pPr>
+              <w:spacing w:after="0" w:line="240" w:lineRule="auto"/>
+              <w:jc w:val="center"/>
+              <w:rPr>
+                <w:rFonts w:ascii="Cavolini" w:eastAsia="Times New Roman" w:hAnsi="Cavolini" w:cs="Cavolini"/>
+                <w:color w:val="000000"/>
+                <w:kern w:val="0"/>
+                <w:lang w:eastAsia="it-IT"/>
+                <w14:ligatures w14:val="none"/>
+              </w:rPr>
+            </w:pPr>
+            <w:r>
+              <w:rPr>
+                <w:rFonts w:ascii="Cavolini" w:eastAsia="Times New Roman" w:hAnsi="Cavolini" w:cs="Cavolini"/>
+                <w:color w:val="000000"/>
+                <w:kern w:val="0"/>
+                <w:lang w:eastAsia="it-IT"/>
+                <w14:ligatures w14:val="none"/>
+              </w:rPr>
+              <w:t>Data</w:t>
+            </w:r>
           </w:p>
         </w:tc>
         <w:tc>
@@ -649,7 +625,6 @@
               <w:right w:val="nil"/>
             </w:tcBorders>
             <w:vAlign w:val="center"/>
-            <w:hideMark/>
           </w:tcPr>
           <w:p>
             <w:pPr>
@@ -931,6 +906,45 @@
             </w:tcBorders>
             <w:noWrap/>
             <w:vAlign w:val="center"/>
+          </w:tcPr>
+          <w:p>
+            <w:pPr>
+              <w:spacing w:after="0" w:line="240" w:lineRule="auto"/>
+              <w:rPr>
+                <w:rFonts w:ascii="Cavolini" w:eastAsia="Times New Roman" w:hAnsi="Cavolini" w:cs="Cavolini"/>
+                <w:color w:val="000000"/>
+                <w:kern w:val="0"/>
+                <w:sz w:val="22"/>
+                <w:szCs w:val="22"/>
+                <w:lang w:eastAsia="it-IT"/>
+                <w14:ligatures w14:val="none"/>
+              </w:rPr>
+            </w:pPr>
+            <w:r>
+              <w:rPr>
+                <w:rFonts w:ascii="Cavolini" w:eastAsia="Times New Roman" w:hAnsi="Cavolini" w:cs="Cavolini"/>
+                <w:color w:val="000000"/>
+                <w:kern w:val="0"/>
+                <w:sz w:val="22"/>
+                <w:szCs w:val="22"/>
+                <w:lang w:eastAsia="it-IT"/>
+                <w14:ligatures w14:val="none"/>
+              </w:rPr>
+              <w:t>#Date</w:t>
+            </w:r>
+          </w:p>
+        </w:tc>
+        <w:tc>
+          <w:tcPr>
+            <w:tcW w:w="1981" w:type="dxa"/>
+            <w:tcBorders>
+              <w:top w:val="nil"/>
+              <w:left w:val="nil"/>
+              <w:bottom w:val="nil"/>
+              <w:right w:val="nil"/>
+            </w:tcBorders>
+            <w:noWrap/>
+            <w:vAlign w:val="center"/>
             <w:hideMark/>
           </w:tcPr>
           <w:p>
@@ -957,23 +971,9 @@
                 <w:lang w:eastAsia="it-IT"/>
                 <w14:ligatures w14:val="none"/>
               </w:rPr>
-              <w:t>#Date</w:t>
-            </w:r>
-          </w:p>
-        </w:tc>
-        <w:tc>
-          <w:tcPr>
-            <w:tcW w:w="1981" w:type="dxa"/>
-            <w:tcBorders>
-              <w:top w:val="nil"/>
-              <w:left w:val="nil"/>
-              <w:bottom w:val="nil"/>
-              <w:right w:val="nil"/>
-            </w:tcBorders>
-            <w:noWrap/>
-            <w:vAlign w:val="center"/>
-            <w:hideMark/>
-          </w:tcPr>
+              <w:t>#Tragitto</w:t>
+            </w:r>
+          </w:p>
           <w:p>
             <w:pPr>
               <w:spacing w:after="0" w:line="240" w:lineRule="auto"/>
@@ -998,19 +998,31 @@
                 <w:lang w:eastAsia="it-IT"/>
                 <w14:ligatures w14:val="none"/>
               </w:rPr>
-              <w:t>#</w:t>
-            </w:r>
-            <w:r>
-              <w:rPr>
-                <w:rFonts w:ascii="Cavolini" w:eastAsia="Times New Roman" w:hAnsi="Cavolini" w:cs="Cavolini"/>
-                <w:color w:val="000000"/>
-                <w:kern w:val="0"/>
-                <w:sz w:val="22"/>
-                <w:szCs w:val="22"/>
-                <w:lang w:eastAsia="it-IT"/>
-                <w14:ligatures w14:val="none"/>
-              </w:rPr>
-              <w:t>Tragitto</w:t>
+              <w:t>(</w:t>
+            </w:r>
+            <w:r>
+              <w:rPr>
+                <w:rFonts w:ascii="Cavolini" w:eastAsia="Times New Roman" w:hAnsi="Cavolini" w:cs="Cavolini"/>
+                <w:color w:val="000000"/>
+                <w:kern w:val="0"/>
+                <w:sz w:val="22"/>
+                <w:szCs w:val="22"/>
+                <w:lang w:eastAsia="it-IT"/>
+                <w14:ligatures w14:val="none"/>
+              </w:rPr>
+              <w:t>#Azienda</w:t>
+            </w:r>
+            <w:r>
+              <w:rPr>
+                <w:rFonts w:ascii="Cavolini" w:eastAsia="Times New Roman" w:hAnsi="Cavolini" w:cs="Cavolini"/>
+                <w:color w:val="000000"/>
+                <w:kern w:val="0"/>
+                <w:sz w:val="22"/>
+                <w:szCs w:val="22"/>
+                <w:lang w:eastAsia="it-IT"/>
+                <w14:ligatures w14:val="none"/>
+              </w:rPr>
+              <w:t>)</w:t>
             </w:r>
           </w:p>
         </w:tc>
@@ -1401,7 +1413,6 @@
           <w:p>
             <w:pPr>
               <w:spacing w:after="0" w:line="240" w:lineRule="auto"/>
-              <w:jc w:val="center"/>
               <w:rPr>
                 <w:rFonts w:ascii="Cavolini" w:eastAsia="Times New Roman" w:hAnsi="Cavolini" w:cs="Cavolini"/>
                 <w:color w:val="000000"/>
@@ -1972,6 +1983,18 @@
                 <w14:ligatures w14:val="none"/>
               </w:rPr>
             </w:pPr>
+            <w:r>
+              <w:rPr>
+                <w:rFonts w:ascii="Cavolini" w:eastAsia="Times New Roman" w:hAnsi="Cavolini" w:cs="Cavolini"/>
+                <w:color w:val="000000"/>
+                <w:kern w:val="0"/>
+                <w:sz w:val="22"/>
+                <w:szCs w:val="22"/>
+                <w:lang w:eastAsia="it-IT"/>
+                <w14:ligatures w14:val="none"/>
+              </w:rPr>
+              <w:t>Totale</w:t>
+            </w:r>
           </w:p>
         </w:tc>
         <w:tc>
@@ -1999,18 +2022,6 @@
                 <w14:ligatures w14:val="none"/>
               </w:rPr>
             </w:pPr>
-            <w:r>
-              <w:rPr>
-                <w:rFonts w:ascii="Cavolini" w:eastAsia="Times New Roman" w:hAnsi="Cavolini" w:cs="Cavolini"/>
-                <w:color w:val="000000"/>
-                <w:kern w:val="0"/>
-                <w:sz w:val="22"/>
-                <w:szCs w:val="22"/>
-                <w:lang w:eastAsia="it-IT"/>
-                <w14:ligatures w14:val="none"/>
-              </w:rPr>
-              <w:t>Totale</w:t>
-            </w:r>
           </w:p>
         </w:tc>
         <w:tc>
@@ -2403,15 +2414,7 @@
     </w:tbl>
     <w:p>
       <w:pPr>
-        <w:ind w:left="-426" w:right="-568"/>
-        <w:rPr>
-          <w:lang w:val="en-US"/>
-        </w:rPr>
-      </w:pPr>
-    </w:p>
-    <w:p>
-      <w:pPr>
-        <w:ind w:left="-426" w:right="-568"/>
+        <w:ind w:right="-568"/>
         <w:rPr>
           <w:lang w:val="en-US"/>
         </w:rPr>
@@ -2600,7 +2603,7 @@
       <w:jc w:val="right"/>
     </w:pPr>
     <w:r>
-      <w:t>Bergamo, Data</w:t>
+      <w:t>Bergamo</w:t>
     </w:r>
     <w:r>
       <w:t>: #data_audit</w:t>

</xml_diff>